<commit_message>
updated IP and added testbench for FIFO overflow and ADC peak reader
(cherry picked from commit 0dc0a72cac9e37c5a2ea532acf05d39eab56f41e)
</commit_message>
<xml_diff>
--- a/FPGA/documentation/Saturn Project FPGA Design Description RPi4.docx
+++ b/FPGA/documentation/Saturn Project FPGA Design Description RPi4.docx
@@ -8671,10 +8671,10 @@
             <v:path o:extrusionok="f" gradientshapeok="t" o:connecttype="rect"/>
             <o:lock v:ext="edit" aspectratio="t"/>
           </v:shapetype>
-          <v:shape id="_x0000_i1025" type="#_x0000_t75" style="width:427pt;height:340pt" o:ole="">
+          <v:shape id="_x0000_i1025" type="#_x0000_t75" style="width:426.8pt;height:339.85pt" o:ole="">
             <v:imagedata r:id="rId15" o:title=""/>
           </v:shape>
-          <o:OLEObject Type="Embed" ProgID="Visio.Drawing.15" ShapeID="_x0000_i1025" DrawAspect="Content" ObjectID="_1829073087" r:id="rId16"/>
+          <o:OLEObject Type="Embed" ProgID="Visio.Drawing.15" ShapeID="_x0000_i1025" DrawAspect="Content" ObjectID="_1833992218" r:id="rId16"/>
         </w:object>
       </w:r>
     </w:p>
@@ -8747,10 +8747,10 @@
       </w:pPr>
       <w:r>
         <w:object w:dxaOrig="8130" w:dyaOrig="4350" w14:anchorId="2CF68001">
-          <v:shape id="_x0000_i1026" type="#_x0000_t75" style="width:408.5pt;height:219pt" o:ole="">
+          <v:shape id="_x0000_i1026" type="#_x0000_t75" style="width:408.4pt;height:218.9pt" o:ole="">
             <v:imagedata r:id="rId17" o:title=""/>
           </v:shape>
-          <o:OLEObject Type="Embed" ProgID="Visio.Drawing.11" ShapeID="_x0000_i1026" DrawAspect="Content" ObjectID="_1829073088" r:id="rId18"/>
+          <o:OLEObject Type="Embed" ProgID="Visio.Drawing.11" ShapeID="_x0000_i1026" DrawAspect="Content" ObjectID="_1833992219" r:id="rId18"/>
         </w:object>
       </w:r>
     </w:p>
@@ -14936,10 +14936,10 @@
     <w:p>
       <w:r>
         <w:object w:dxaOrig="4394" w:dyaOrig="2920" w14:anchorId="495F39FC">
-          <v:shape id="_x0000_i1027" type="#_x0000_t75" style="width:219.5pt;height:144.5pt" o:ole="">
+          <v:shape id="_x0000_i1027" type="#_x0000_t75" style="width:219.45pt;height:144.6pt" o:ole="">
             <v:imagedata r:id="rId23" o:title=""/>
           </v:shape>
-          <o:OLEObject Type="Embed" ProgID="Excel.Sheet.12" ShapeID="_x0000_i1027" DrawAspect="Content" ObjectID="_1829073089" r:id="rId24"/>
+          <o:OLEObject Type="Embed" ProgID="Excel.Sheet.12" ShapeID="_x0000_i1027" DrawAspect="Content" ObjectID="_1833992220" r:id="rId24"/>
         </w:object>
       </w:r>
     </w:p>
@@ -14962,10 +14962,10 @@
     <w:p>
       <w:r>
         <w:object w:dxaOrig="8740" w:dyaOrig="3210" w14:anchorId="654049C4">
-          <v:shape id="_x0000_i1028" type="#_x0000_t75" style="width:437pt;height:160.5pt" o:ole="">
+          <v:shape id="_x0000_i1028" type="#_x0000_t75" style="width:437.2pt;height:160.7pt" o:ole="">
             <v:imagedata r:id="rId25" o:title=""/>
           </v:shape>
-          <o:OLEObject Type="Embed" ProgID="Excel.Sheet.12" ShapeID="_x0000_i1028" DrawAspect="Content" ObjectID="_1829073090" r:id="rId26"/>
+          <o:OLEObject Type="Embed" ProgID="Excel.Sheet.12" ShapeID="_x0000_i1028" DrawAspect="Content" ObjectID="_1833992221" r:id="rId26"/>
         </w:object>
       </w:r>
     </w:p>
@@ -15338,10 +15338,10 @@
       </w:pPr>
       <w:r>
         <w:object w:dxaOrig="11631" w:dyaOrig="12199" w14:anchorId="07F28A8A">
-          <v:shape id="_x0000_i1029" type="#_x0000_t75" style="width:441pt;height:463pt" o:ole="">
+          <v:shape id="_x0000_i1029" type="#_x0000_t75" style="width:440.65pt;height:463.1pt" o:ole="">
             <v:imagedata r:id="rId28" o:title=""/>
           </v:shape>
-          <o:OLEObject Type="Embed" ProgID="Excel.Sheet.12" ShapeID="_x0000_i1029" DrawAspect="Content" ObjectID="_1829073091" r:id="rId29"/>
+          <o:OLEObject Type="Embed" ProgID="Excel.Sheet.12" ShapeID="_x0000_i1029" DrawAspect="Content" ObjectID="_1833992222" r:id="rId29"/>
         </w:object>
       </w:r>
     </w:p>
@@ -15501,7 +15501,7 @@
             <v:imagedata r:id="rId30" o:title=""/>
             <w10:wrap type="square" side="right"/>
           </v:shape>
-          <o:OLEObject Type="Embed" ProgID="Excel.Sheet.12" ShapeID="_x0000_s1038" DrawAspect="Content" ObjectID="_1829073099" r:id="rId31"/>
+          <o:OLEObject Type="Embed" ProgID="Excel.Sheet.12" ShapeID="_x0000_s1038" DrawAspect="Content" ObjectID="_1833992230" r:id="rId31"/>
         </w:object>
       </w:r>
       <w:r>
@@ -18855,10 +18855,10 @@
       </w:pPr>
       <w:r>
         <w:object w:dxaOrig="8460" w:dyaOrig="6211" w14:anchorId="59F0F0BD">
-          <v:shape id="_x0000_i1031" type="#_x0000_t75" style="width:424pt;height:312pt" o:ole="">
+          <v:shape id="_x0000_i1031" type="#_x0000_t75" style="width:423.95pt;height:312.2pt" o:ole="">
             <v:imagedata r:id="rId35" o:title=""/>
           </v:shape>
-          <o:OLEObject Type="Embed" ProgID="Visio.Drawing.11" ShapeID="_x0000_i1031" DrawAspect="Content" ObjectID="_1829073092" r:id="rId36"/>
+          <o:OLEObject Type="Embed" ProgID="Visio.Drawing.11" ShapeID="_x0000_i1031" DrawAspect="Content" ObjectID="_1833992223" r:id="rId36"/>
         </w:object>
       </w:r>
     </w:p>
@@ -20367,10 +20367,10 @@
       </w:pPr>
       <w:r>
         <w:object w:dxaOrig="6435" w:dyaOrig="5640" w14:anchorId="0B505A1B">
-          <v:shape id="_x0000_i1032" type="#_x0000_t75" style="width:322pt;height:283pt" o:ole="">
+          <v:shape id="_x0000_i1032" type="#_x0000_t75" style="width:322pt;height:283.4pt" o:ole="">
             <v:imagedata r:id="rId39" o:title=""/>
           </v:shape>
-          <o:OLEObject Type="Embed" ProgID="Visio.Drawing.11" ShapeID="_x0000_i1032" DrawAspect="Content" ObjectID="_1829073093" r:id="rId40"/>
+          <o:OLEObject Type="Embed" ProgID="Visio.Drawing.11" ShapeID="_x0000_i1032" DrawAspect="Content" ObjectID="_1833992224" r:id="rId40"/>
         </w:object>
       </w:r>
     </w:p>
@@ -20451,10 +20451,10 @@
     <w:p>
       <w:r>
         <w:object w:dxaOrig="8275" w:dyaOrig="2920" w14:anchorId="249D7050">
-          <v:shape id="_x0000_i1033" type="#_x0000_t75" style="width:415pt;height:145pt" o:ole="">
+          <v:shape id="_x0000_i1033" type="#_x0000_t75" style="width:414.7pt;height:145.15pt" o:ole="">
             <v:imagedata r:id="rId41" o:title=""/>
           </v:shape>
-          <o:OLEObject Type="Embed" ProgID="Excel.Sheet.12" ShapeID="_x0000_i1033" DrawAspect="Content" ObjectID="_1829073094" r:id="rId42"/>
+          <o:OLEObject Type="Embed" ProgID="Excel.Sheet.12" ShapeID="_x0000_i1033" DrawAspect="Content" ObjectID="_1833992225" r:id="rId42"/>
         </w:object>
       </w:r>
     </w:p>
@@ -23176,10 +23176,10 @@
       </w:pPr>
       <w:r>
         <w:object w:dxaOrig="8460" w:dyaOrig="4141" w14:anchorId="46EA70DF">
-          <v:shape id="_x0000_i1034" type="#_x0000_t75" style="width:424pt;height:207pt" o:ole="">
+          <v:shape id="_x0000_i1034" type="#_x0000_t75" style="width:423.95pt;height:206.8pt" o:ole="">
             <v:imagedata r:id="rId44" o:title=""/>
           </v:shape>
-          <o:OLEObject Type="Embed" ProgID="Visio.Drawing.11" ShapeID="_x0000_i1034" DrawAspect="Content" ObjectID="_1829073095" r:id="rId45"/>
+          <o:OLEObject Type="Embed" ProgID="Visio.Drawing.11" ShapeID="_x0000_i1034" DrawAspect="Content" ObjectID="_1833992226" r:id="rId45"/>
         </w:object>
       </w:r>
     </w:p>
@@ -24596,11 +24596,9 @@
             <w:r>
               <w:t xml:space="preserve">CWX </w:t>
             </w:r>
-            <w:proofErr w:type="spellStart"/>
             <w:r>
               <w:t>Straightkey</w:t>
             </w:r>
-            <w:proofErr w:type="spellEnd"/>
           </w:p>
         </w:tc>
         <w:tc>
@@ -32437,10 +32435,10 @@
     <w:p>
       <w:r>
         <w:object w:dxaOrig="7887" w:dyaOrig="2340" w14:anchorId="494DF00A">
-          <v:shape id="_x0000_i1035" type="#_x0000_t75" style="width:395pt;height:117pt" o:ole="">
+          <v:shape id="_x0000_i1035" type="#_x0000_t75" style="width:395.15pt;height:116.95pt" o:ole="">
             <v:imagedata r:id="rId55" o:title=""/>
           </v:shape>
-          <o:OLEObject Type="Embed" ProgID="Excel.Sheet.12" ShapeID="_x0000_i1035" DrawAspect="Content" ObjectID="_1829073096" r:id="rId56"/>
+          <o:OLEObject Type="Embed" ProgID="Excel.Sheet.12" ShapeID="_x0000_i1035" DrawAspect="Content" ObjectID="_1833992227" r:id="rId56"/>
         </w:object>
       </w:r>
     </w:p>
@@ -32517,10 +32515,10 @@
     <w:p>
       <w:r>
         <w:object w:dxaOrig="9392" w:dyaOrig="4052" w14:anchorId="4DFE7B16">
-          <v:shape id="_x0000_i1036" type="#_x0000_t75" style="width:469.5pt;height:202pt" o:ole="">
+          <v:shape id="_x0000_i1036" type="#_x0000_t75" style="width:469.45pt;height:202.2pt" o:ole="">
             <v:imagedata r:id="rId57" o:title=""/>
           </v:shape>
-          <o:OLEObject Type="Embed" ProgID="Excel.Sheet.12" ShapeID="_x0000_i1036" DrawAspect="Content" ObjectID="_1829073097" r:id="rId58"/>
+          <o:OLEObject Type="Embed" ProgID="Excel.Sheet.12" ShapeID="_x0000_i1036" DrawAspect="Content" ObjectID="_1833992228" r:id="rId58"/>
         </w:object>
       </w:r>
     </w:p>
@@ -32694,10 +32692,10 @@
     <w:p>
       <w:r>
         <w:object w:dxaOrig="6748" w:dyaOrig="2137" w14:anchorId="71B641DD">
-          <v:shape id="_x0000_i1037" type="#_x0000_t75" style="width:337.5pt;height:107pt" o:ole="">
+          <v:shape id="_x0000_i1037" type="#_x0000_t75" style="width:337.55pt;height:107.15pt" o:ole="">
             <v:imagedata r:id="rId59" o:title=""/>
           </v:shape>
-          <o:OLEObject Type="Embed" ProgID="Excel.Sheet.12" ShapeID="_x0000_i1037" DrawAspect="Content" ObjectID="_1829073098" r:id="rId60"/>
+          <o:OLEObject Type="Embed" ProgID="Excel.Sheet.12" ShapeID="_x0000_i1037" DrawAspect="Content" ObjectID="_1833992229" r:id="rId60"/>
         </w:object>
       </w:r>
     </w:p>

</xml_diff>